<commit_message>
Implement audited T0 diagnostics and bounded paired PPO pilot
</commit_message>
<xml_diff>
--- a/JIT/docs/paper/JIT_GENERATIVE_BRIDGE_DRAFT.docx
+++ b/JIT/docs/paper/JIT_GENERATIVE_BRIDGE_DRAFT.docx
@@ -3927,6 +3927,29 @@
     </w:p>
     <w:p>
       <w:pPr>
+        <w:pStyle w:val="Heading3"/>
+      </w:pPr>
+      <w:r>
+        <w:t>6.4.1 保存观测上的交叉诊断：拟合改善与状态分布偏差</w:t>
+      </w:r>
+    </w:p>
+    <w:p>
+      <w:r>
+        <w:t>在固定525帧原始示范、228帧自访示范、6289帧保持数据及249帧历史稳定学生访问状态上，T0对两轮0／100／500／1000共8个冻结模型进行CPU交叉推理，总计7291条共同观测，未新增物理交互或参数更新。独立CPU前向与原生Brax CPU前向最大动作差为2.68×10⁻⁷；96条保存执行链中独立CPU与保存执行动作最大差为7.42×10⁻⁴，低于由π₀预定公式max(10⁻⁶，10×π₀最大重建误差)得到的5.59×10⁻³门槛。该工程验收不表示CPU／GPU位级一致，不能据此认定数值差异的具体成因。[E10]</w:t>
+      </w:r>
+    </w:p>
+    <w:p>
+      <w:r>
+        <w:t>匹配BC1000时，自访示范学习使新增228帧上的逐帧动作MSE由8.45×10⁻⁴降至5.02×10⁻⁴，但原525帧上的MSE由1.40×10⁻³升至1.53×10⁻³，旧四个稳定学生根249帧访问状态上的MSE由1.17×10⁻⁸升至7.77×10⁻⁵。原始与新增示范分别以相应教师的实际执行动作为目标，249帧旧稳定学生访问状态以旧coverage BC1000的实际执行动作为诊断参考。这些误差来自同一保存观测上的交叉推理，与不同闭环状态上同tick动作差严格区分。新学生在新增示范与历史稳定学生访问状态上的固定TRAIN损失梯度余弦为−0.867，结合root30／68的成功交换提示监督目标和访问状态之间的权衡；不证明容量不足或闭环改善。[E10]</w:t>
+      </w:r>
+    </w:p>
+    <w:p>
+      <w:r>
+        <w:t>root55在首次评测及两次固定复核中为1／0／0。以独立10⁻⁶描述阈值，qvel首先在tick24分歧、前置观测在25分歧、执行动作在26分歧，属于接触附近的数值放大线索；该阈值与上述动作重建工程容差不同，保留各状态分量的原单位。原始共同观测、逐根误差、梯度及分歧图均可从证据索引追溯。[E10]</w:t>
+      </w:r>
+    </w:p>
+    <w:p>
+      <w:pPr>
         <w:pStyle w:val="Heading2"/>
       </w:pPr>
       <w:r>
@@ -4520,7 +4543,7 @@
                 <w:b/>
                 <w:sz w:val="16"/>
               </w:rPr>
-              <w:t>统一总成本</w:t>
+              <w:t>分项成本</w:t>
             </w:r>
           </w:p>
         </w:tc>
@@ -4542,26 +4565,24 @@
               <w:rPr>
                 <w:sz w:val="16"/>
               </w:rPr>
-              <w:t>冻结π₀</w:t>
+              <w:t>冻结π₀参考</w:t>
             </w:r>
           </w:p>
         </w:tc>
         <w:tc>
           <w:tcPr>
             <w:tcW w:type="dxa" w:w="1606"/>
-            <w:shd w:fill="FFF2CC"/>
           </w:tcPr>
           <w:p>
             <w:pPr>
               <w:keepNext/>
               <w:spacing w:after="60" w:before="60" w:line="259" w:lineRule="auto"/>
-              <w:shd w:fill="FFF2CC"/>
             </w:pPr>
             <w:r>
               <w:rPr>
                 <w:sz w:val="16"/>
               </w:rPr>
-              <w:t>【待补P1】</w:t>
+              <w:t>固定源模型</w:t>
             </w:r>
           </w:p>
         </w:tc>
@@ -4651,26 +4672,24 @@
               <w:rPr>
                 <w:sz w:val="16"/>
               </w:rPr>
-              <w:t>等预算继续PPO</w:t>
+              <w:t>M0：等物理预算继续PPO＋keep</w:t>
             </w:r>
           </w:p>
         </w:tc>
         <w:tc>
           <w:tcPr>
             <w:tcW w:type="dxa" w:w="1606"/>
-            <w:shd w:fill="FFF2CC"/>
           </w:tcPr>
           <w:p>
             <w:pPr>
               <w:keepNext/>
               <w:spacing w:after="60" w:before="60" w:line="259" w:lineRule="auto"/>
-              <w:shd w:fill="FFF2CC"/>
             </w:pPr>
             <w:r>
               <w:rPr>
                 <w:sz w:val="16"/>
               </w:rPr>
-              <w:t>【待补P1】</w:t>
+              <w:t>3，尚未执行</w:t>
             </w:r>
           </w:p>
         </w:tc>
@@ -4760,26 +4779,24 @@
               <w:rPr>
                 <w:sz w:val="16"/>
               </w:rPr>
-              <w:t>随机探索＋相同学习器</w:t>
+              <w:t>M1：完整JIT，E＋G＋π＋显式反馈</w:t>
             </w:r>
           </w:p>
         </w:tc>
         <w:tc>
           <w:tcPr>
             <w:tcW w:type="dxa" w:w="1606"/>
-            <w:shd w:fill="FFF2CC"/>
           </w:tcPr>
           <w:p>
             <w:pPr>
               <w:keepNext/>
               <w:spacing w:after="60" w:before="60" w:line="259" w:lineRule="auto"/>
-              <w:shd w:fill="FFF2CC"/>
             </w:pPr>
             <w:r>
               <w:rPr>
                 <w:sz w:val="16"/>
               </w:rPr>
-              <w:t>【待补P2】</w:t>
+              <w:t>3，尚未执行</w:t>
             </w:r>
           </w:p>
         </w:tc>
@@ -4869,26 +4886,131 @@
               <w:rPr>
                 <w:sz w:val="16"/>
               </w:rPr>
-              <w:t>学习探索＋Noise教师＋相同学习器</w:t>
+              <w:t>M2：随机探索＋G＋相同学生</w:t>
             </w:r>
           </w:p>
         </w:tc>
         <w:tc>
           <w:tcPr>
             <w:tcW w:type="dxa" w:w="1606"/>
-            <w:shd w:fill="FFF2CC"/>
           </w:tcPr>
           <w:p>
             <w:pPr>
               <w:keepNext/>
               <w:spacing w:after="60" w:before="60" w:line="259" w:lineRule="auto"/>
-              <w:shd w:fill="FFF2CC"/>
             </w:pPr>
             <w:r>
               <w:rPr>
                 <w:sz w:val="16"/>
               </w:rPr>
-              <w:t>【待补P3】</w:t>
+              <w:t>3，尚未执行</w:t>
+            </w:r>
+          </w:p>
+        </w:tc>
+        <w:tc>
+          <w:tcPr>
+            <w:tcW w:type="dxa" w:w="1606"/>
+          </w:tcPr>
+          <w:p>
+            <w:pPr>
+              <w:keepNext/>
+              <w:spacing w:after="60" w:before="60" w:line="259" w:lineRule="auto"/>
+            </w:pPr>
+            <w:r>
+              <w:rPr>
+                <w:sz w:val="16"/>
+              </w:rPr>
+              <w:t>—</w:t>
+            </w:r>
+          </w:p>
+        </w:tc>
+        <w:tc>
+          <w:tcPr>
+            <w:tcW w:type="dxa" w:w="1606"/>
+          </w:tcPr>
+          <w:p>
+            <w:pPr>
+              <w:keepNext/>
+              <w:spacing w:after="60" w:before="60" w:line="259" w:lineRule="auto"/>
+            </w:pPr>
+            <w:r>
+              <w:rPr>
+                <w:sz w:val="16"/>
+              </w:rPr>
+              <w:t>—</w:t>
+            </w:r>
+          </w:p>
+        </w:tc>
+        <w:tc>
+          <w:tcPr>
+            <w:tcW w:type="dxa" w:w="1606"/>
+          </w:tcPr>
+          <w:p>
+            <w:pPr>
+              <w:keepNext/>
+              <w:spacing w:after="60" w:before="60" w:line="259" w:lineRule="auto"/>
+            </w:pPr>
+            <w:r>
+              <w:rPr>
+                <w:sz w:val="16"/>
+              </w:rPr>
+              <w:t>—</w:t>
+            </w:r>
+          </w:p>
+        </w:tc>
+        <w:tc>
+          <w:tcPr>
+            <w:tcW w:type="dxa" w:w="1606"/>
+          </w:tcPr>
+          <w:p>
+            <w:pPr>
+              <w:keepNext/>
+              <w:spacing w:after="60" w:before="60" w:line="259" w:lineRule="auto"/>
+            </w:pPr>
+            <w:r>
+              <w:rPr>
+                <w:sz w:val="16"/>
+              </w:rPr>
+              <w:t>—</w:t>
+            </w:r>
+          </w:p>
+        </w:tc>
+      </w:tr>
+      <w:tr>
+        <w:trPr>
+          <w:cantSplit/>
+        </w:trPr>
+        <w:tc>
+          <w:tcPr>
+            <w:tcW w:type="dxa" w:w="1606"/>
+          </w:tcPr>
+          <w:p>
+            <w:pPr>
+              <w:keepNext/>
+              <w:spacing w:after="60" w:before="60" w:line="259" w:lineRule="auto"/>
+            </w:pPr>
+            <w:r>
+              <w:rPr>
+                <w:sz w:val="16"/>
+              </w:rPr>
+              <w:t>M3：学习E＋16候选Noise＋相同学生</w:t>
+            </w:r>
+          </w:p>
+        </w:tc>
+        <w:tc>
+          <w:tcPr>
+            <w:tcW w:type="dxa" w:w="1606"/>
+          </w:tcPr>
+          <w:p>
+            <w:pPr>
+              <w:keepNext/>
+              <w:spacing w:after="60" w:before="60" w:line="259" w:lineRule="auto"/>
+            </w:pPr>
+            <w:r>
+              <w:rPr>
+                <w:sz w:val="16"/>
+              </w:rPr>
+              <w:t>3，尚未执行</w:t>
             </w:r>
           </w:p>
         </w:tc>
@@ -4978,26 +5100,24 @@
               <w:rPr>
                 <w:sz w:val="16"/>
               </w:rPr>
-              <w:t>完整JIT：E＋G＋π＋反馈</w:t>
+              <w:t>M4：关闭两条显式学生反馈通路</w:t>
             </w:r>
           </w:p>
         </w:tc>
         <w:tc>
           <w:tcPr>
             <w:tcW w:type="dxa" w:w="1606"/>
-            <w:shd w:fill="FFF2CC"/>
           </w:tcPr>
           <w:p>
             <w:pPr>
               <w:keepNext w:val="0"/>
               <w:spacing w:after="60" w:before="60" w:line="259" w:lineRule="auto"/>
-              <w:shd w:fill="FFF2CC"/>
             </w:pPr>
             <w:r>
               <w:rPr>
                 <w:sz w:val="16"/>
               </w:rPr>
-              <w:t>【待补P1—P4】</w:t>
+              <w:t>3，尚未执行</w:t>
             </w:r>
           </w:p>
         </w:tc>
@@ -5081,7 +5201,7 @@
         <w:shd w:fill="FFF2CC"/>
       </w:pPr>
       <w:r>
-        <w:t>【待补P1：最终学生净收益】这里放同一源策略、统一成功标准和完整自然起点下的独立训练种子结果。建议至少3个独立训练种子作初步统计，并依观察到的方差确定更多重复；不能将3次固定复核替代训练种子。应给出逐种子成功率、新增与旧损失，以及与等预算继续PPO的配对比较。该建议不表示已授权或已经执行这些训练。</w:t>
+        <w:t>【待补P1：最终学生净收益】这里放同一源策略、统一成功标准和完整自然起点下的独立训练种子结果。2026年10月11日已声明三个配对外循环训练种子1011501、1011502、1011503，各臂共同π₀，适用臂共同预训练G73，后续模型、数据及随机流独立；应准确称为共同π₀及预训练G条件下的独立外循环训练。三次固定复核不能替代训练种子。用户已授权条件性实施：T0运行链与T1两臂32k机制筛查通过后先执行M1／M0；整体收益及保持性通过才进入其余消融。正式矩阵尚未执行，应给出逐种子成功率、新增、旧损失及区间；M0明确包含keep，仅匹配M1实际新增物理预算，E／G优化与GPU时间另列。</w:t>
       </w:r>
     </w:p>
     <w:p>
@@ -5089,7 +5209,7 @@
         <w:shd w:fill="FFF2CC"/>
       </w:pPr>
       <w:r>
-        <w:t>【待补P2：可学习探索的作用】这里放固定后续教师／学生、学习E与随机探索等总预算的对照。图应同时显示真实状态覆盖、可验证恢复指导产出和最终学生收益随成本变化，防止以轨迹宽度或新颖性奖励替代可学习性。</w:t>
+        <w:t>【待补P2：可学习探索的作用】这里放固定后续教师／学生、轮数和候选／学生更新预算的学习E与随机探索对照，同时报告实际物理及优化成本差异。图应同时显示真实状态覆盖、可验证恢复指导产出和最终学生收益随成本变化，防止以轨迹宽度或新颖性奖励替代可学习性。</w:t>
       </w:r>
     </w:p>
     <w:p>
@@ -5105,7 +5225,7 @@
         <w:shd w:fill="FFF2CC"/>
       </w:pPr>
       <w:r>
-        <w:t>【待补P4：学习进展反馈的作用】这里放开／关反馈的同预算多轮对照，记录每轮实际探索奖励、合格教案、策略新增／丢失及固定独立评价。应固定学生继承与候选处理规则，不能用“连续运行了很多轮”代替学习进展有效性。</w:t>
+        <w:t>【待补P4：学习进展反馈的作用】这里放关闭E学生质量奖励及学生成功轨迹回流G的组合消融，保留新颖性、物理失败罚、学生更新和候选处理规则；该实验只回答显式反馈整体贡献，不能分别归因两条箭头。多轮对照应记录每轮实际探索奖励、合格教案、策略新增／丢失及固定独立评价。应固定学生继承与候选处理规则，不能用“连续运行了很多轮”代替学习进展有效性。</w:t>
       </w:r>
     </w:p>
     <w:p>
@@ -5113,7 +5233,7 @@
         <w:shd w:fill="FFF2CC"/>
       </w:pPr>
       <w:r>
-        <w:t>【待补P5：未见扰动与同身份sim2sim】这里放冻结最终JIT学生后，对未见控制扰动、外力扰动及初态的完整评价，并在两个引擎中使用同一Actor／normalizer和统一终点。若目标引擎进行了训练或物理标定，需分别报告适配预算和条件；当前已有双引擎示例不填入这一空表。</w:t>
+        <w:t>【待补P5：未见扰动与同身份sim2sim】这里放冻结最终JIT学生后，对预声明未见初态、控制脉冲及其组合和外推请求幅值／起扰时点的完整评价（257条件，三次固定重复），并在两个引擎中使用同一Actor／normalizer和统一终点。若目标引擎进行了训练或物理标定，需分别报告适配预算和条件；当前已有双引擎示例不填入这一空表。该TEST只验证控制扰动泛化，不声明真实外力泛化；实机暂不作为投稿前置。同身份目标评价默认零目标训练，统一25步及最低前速判据。</w:t>
       </w:r>
     </w:p>
     <w:p>
@@ -5917,7 +6037,7 @@
           </w:tcPr>
           <w:p>
             <w:pPr>
-              <w:keepNext w:val="0"/>
+              <w:keepNext/>
               <w:spacing w:after="60" w:before="60" w:line="259" w:lineRule="auto"/>
             </w:pPr>
             <w:r>
@@ -5934,7 +6054,7 @@
           </w:tcPr>
           <w:p>
             <w:pPr>
-              <w:keepNext w:val="0"/>
+              <w:keepNext/>
               <w:spacing w:after="60" w:before="60" w:line="259" w:lineRule="auto"/>
             </w:pPr>
             <w:hyperlink r:id="rId33">
@@ -5953,6 +6073,86 @@
           </w:tcPr>
           <w:p>
             <w:pPr>
+              <w:keepNext/>
+              <w:spacing w:after="60" w:before="60" w:line="259" w:lineRule="auto"/>
+            </w:pPr>
+            <w:r>
+              <w:rPr>
+                <w:sz w:val="18"/>
+              </w:rPr>
+              <w:t>第4节网络、时序与反馈实现</w:t>
+            </w:r>
+          </w:p>
+        </w:tc>
+      </w:tr>
+      <w:tr>
+        <w:trPr>
+          <w:cantSplit/>
+        </w:trPr>
+        <w:tc>
+          <w:tcPr>
+            <w:tcW w:type="dxa" w:w="3213"/>
+          </w:tcPr>
+          <w:p>
+            <w:pPr>
+              <w:keepNext/>
+              <w:spacing w:after="60" w:before="60" w:line="259" w:lineRule="auto"/>
+            </w:pPr>
+            <w:r>
+              <w:rPr>
+                <w:sz w:val="18"/>
+              </w:rPr>
+              <w:t>E10</w:t>
+            </w:r>
+          </w:p>
+        </w:tc>
+        <w:tc>
+          <w:tcPr>
+            <w:tcW w:type="dxa" w:w="3213"/>
+          </w:tcPr>
+          <w:p>
+            <w:pPr>
+              <w:keepNext/>
+              <w:spacing w:after="60" w:before="60" w:line="259" w:lineRule="auto"/>
+            </w:pPr>
+            <w:hyperlink r:id="rId34">
+              <w:r>
+                <w:rPr>
+                  <w:color w:val="195C80"/>
+                </w:rPr>
+                <w:t>T0保存观测交叉诊断及真实XY</w:t>
+              </w:r>
+            </w:hyperlink>
+          </w:p>
+        </w:tc>
+        <w:tc>
+          <w:tcPr>
+            <w:tcW w:type="dxa" w:w="3213"/>
+          </w:tcPr>
+          <w:p>
+            <w:pPr>
+              <w:keepNext/>
+              <w:spacing w:after="60" w:before="60" w:line="259" w:lineRule="auto"/>
+            </w:pPr>
+            <w:r>
+              <w:rPr>
+                <w:sz w:val="18"/>
+              </w:rPr>
+              <w:t>第6.4.1节，同状态误差、分歧与执行链</w:t>
+            </w:r>
+          </w:p>
+        </w:tc>
+      </w:tr>
+      <w:tr>
+        <w:trPr>
+          <w:cantSplit/>
+        </w:trPr>
+        <w:tc>
+          <w:tcPr>
+            <w:tcW w:type="dxa" w:w="3213"/>
+          </w:tcPr>
+          <w:p>
+            <w:pPr>
               <w:keepNext w:val="0"/>
               <w:spacing w:after="60" w:before="60" w:line="259" w:lineRule="auto"/>
             </w:pPr>
@@ -5960,7 +6160,43 @@
               <w:rPr>
                 <w:sz w:val="18"/>
               </w:rPr>
-              <w:t>第4节网络、时序与反馈实现</w:t>
+              <w:t>E11</w:t>
+            </w:r>
+          </w:p>
+        </w:tc>
+        <w:tc>
+          <w:tcPr>
+            <w:tcW w:type="dxa" w:w="3213"/>
+          </w:tcPr>
+          <w:p>
+            <w:pPr>
+              <w:keepNext w:val="0"/>
+              <w:spacing w:after="60" w:before="60" w:line="259" w:lineRule="auto"/>
+            </w:pPr>
+            <w:hyperlink r:id="rId35">
+              <w:r>
+                <w:rPr>
+                  <w:color w:val="195C80"/>
+                </w:rPr>
+                <w:t>同身份导出零物理预检</w:t>
+              </w:r>
+            </w:hyperlink>
+          </w:p>
+        </w:tc>
+        <w:tc>
+          <w:tcPr>
+            <w:tcW w:type="dxa" w:w="3213"/>
+          </w:tcPr>
+          <w:p>
+            <w:pPr>
+              <w:keepNext w:val="0"/>
+              <w:spacing w:after="60" w:before="60" w:line="259" w:lineRule="auto"/>
+            </w:pPr>
+            <w:r>
+              <w:rPr>
+                <w:sz w:val="18"/>
+              </w:rPr>
+              <w:t>源π₀推理一致；目标任务适配尚未就绪</w:t>
             </w:r>
           </w:p>
         </w:tc>

</xml_diff>

<commit_message>
Fix reset RNG representation and preserve failed pilot evidence
</commit_message>
<xml_diff>
--- a/JIT/docs/paper/JIT_GENERATIVE_BRIDGE_DRAFT.docx
+++ b/JIT/docs/paper/JIT_GENERATIVE_BRIDGE_DRAFT.docx
@@ -3950,6 +3950,19 @@
     </w:p>
     <w:p>
       <w:pPr>
+        <w:pStyle w:val="Heading3"/>
+      </w:pPr>
+      <w:r>
+        <w:t>6.4.2 有限PPO试验的工程边界</w:t>
+      </w:r>
+    </w:p>
+    <w:p>
+      <w:r>
+        <w:t>T1两臂各32,000步的机制试验已冻结并于2026年10月11日启动，但在四池reset状态合并阶段因随机键数组表示不兼容而停止：新reset采用uint32(2,)键，快照恢复采用标量typed key；该堆叠错误可纯CPU复现，尚未进入PPO更新或终点评价。生产运行T1_paired_ppo_001保守计入200步失败预留，两臂训练均为0／32,000，机制门槛状态为未完成而非不通过。按预声明规则不自动重试、扩大预算或启动正式矩阵；该工程失败不支持关于指导有效性或无效性的结论。[E12]</w:t>
+      </w:r>
+    </w:p>
+    <w:p>
+      <w:pPr>
         <w:pStyle w:val="Heading2"/>
       </w:pPr>
       <w:r>
@@ -6153,7 +6166,7 @@
           </w:tcPr>
           <w:p>
             <w:pPr>
-              <w:keepNext w:val="0"/>
+              <w:keepNext/>
               <w:spacing w:after="60" w:before="60" w:line="259" w:lineRule="auto"/>
             </w:pPr>
             <w:r>
@@ -6170,7 +6183,7 @@
           </w:tcPr>
           <w:p>
             <w:pPr>
-              <w:keepNext w:val="0"/>
+              <w:keepNext/>
               <w:spacing w:after="60" w:before="60" w:line="259" w:lineRule="auto"/>
             </w:pPr>
             <w:hyperlink r:id="rId35">
@@ -6189,6 +6202,28 @@
           </w:tcPr>
           <w:p>
             <w:pPr>
+              <w:keepNext/>
+              <w:spacing w:after="60" w:before="60" w:line="259" w:lineRule="auto"/>
+            </w:pPr>
+            <w:r>
+              <w:rPr>
+                <w:sz w:val="18"/>
+              </w:rPr>
+              <w:t>源π₀推理一致；目标任务适配尚未就绪</w:t>
+            </w:r>
+          </w:p>
+        </w:tc>
+      </w:tr>
+      <w:tr>
+        <w:trPr>
+          <w:cantSplit/>
+        </w:trPr>
+        <w:tc>
+          <w:tcPr>
+            <w:tcW w:type="dxa" w:w="3213"/>
+          </w:tcPr>
+          <w:p>
+            <w:pPr>
               <w:keepNext w:val="0"/>
               <w:spacing w:after="60" w:before="60" w:line="259" w:lineRule="auto"/>
             </w:pPr>
@@ -6196,7 +6231,43 @@
               <w:rPr>
                 <w:sz w:val="18"/>
               </w:rPr>
-              <w:t>源π₀推理一致；目标任务适配尚未就绪</w:t>
+              <w:t>E12</w:t>
+            </w:r>
+          </w:p>
+        </w:tc>
+        <w:tc>
+          <w:tcPr>
+            <w:tcW w:type="dxa" w:w="3213"/>
+          </w:tcPr>
+          <w:p>
+            <w:pPr>
+              <w:keepNext w:val="0"/>
+              <w:spacing w:after="60" w:before="60" w:line="259" w:lineRule="auto"/>
+            </w:pPr>
+            <w:hyperlink r:id="rId36">
+              <w:r>
+                <w:rPr>
+                  <w:color w:val="195C80"/>
+                </w:rPr>
+                <w:t>T1工程停止收据</w:t>
+              </w:r>
+            </w:hyperlink>
+          </w:p>
+        </w:tc>
+        <w:tc>
+          <w:tcPr>
+            <w:tcW w:type="dxa" w:w="3213"/>
+          </w:tcPr>
+          <w:p>
+            <w:pPr>
+              <w:keepNext w:val="0"/>
+              <w:spacing w:after="60" w:before="60" w:line="259" w:lineRule="auto"/>
+            </w:pPr>
+            <w:r>
+              <w:rPr>
+                <w:sz w:val="18"/>
+              </w:rPr>
+              <w:t>两臂训练0，机制评价尚未完成</w:t>
             </w:r>
           </w:p>
         </w:tc>

</xml_diff>

<commit_message>
Analyze rejected T1 mechanism screen and update Chinese manuscript
</commit_message>
<xml_diff>
--- a/JIT/docs/paper/JIT_GENERATIVE_BRIDGE_DRAFT.docx
+++ b/JIT/docs/paper/JIT_GENERATIVE_BRIDGE_DRAFT.docx
@@ -46,7 +46,7 @@
     </w:p>
     <w:p>
       <w:r>
-        <w:t>本文报告固定方法契约下的阶段性开发证据。对160个新采集初态筛查后，选取16个TRAIN与7个SOLVER_DEV稳定失败根进行同状态教师比较：生成教师与有色噪声教师在固定赢家重复验证资格上呈互补，生成教师形成8条合格TRAIN教案。在8个学生训练根的24个自身访问状态查询中，12个查询满足源策略三次失败、固定生成教师三次成功；其中4条指导来自3个历史稳定失败祖先。新增自身访问指导后，学生三次复核的稳定吸收仍为4/8；一个失败根被修复，同时一个原成功根丢失。完整开发集首次评测为56/64，相对原π₀新增20例、丢失2例，但该配对改善尚缺重复确认。本文据此支持“有限状态上存在可验证恢复指导”及“指导到学生的转化可被分解测量”，尚不支持扩散必要性、可靠无遗忘或最终单策略泛化优势。多种子等成本比较与统一口径迁移评价保留为明确待补实验。</w:t>
+        <w:t>本文报告固定方法契约下的阶段性开发证据。对160个新采集初态筛查后，选取16个TRAIN与7个SOLVER_DEV稳定失败根进行同状态教师比较：生成教师与有色噪声教师在固定赢家重复验证资格上呈互补，生成教师形成8条合格TRAIN教案。在8个学生训练根的24个自身访问状态查询中，12个查询满足源策略三次失败、固定生成教师三次成功；其中4条指导来自3个历史稳定失败祖先。新增自身访问指导后，学生三次复核的稳定吸收仍为4/8；一个失败根被修复，同时一个原成功根丢失。完整开发集首次评测为56/64，相对原π₀新增20例、丢失2例，但该配对改善尚缺重复确认。随后从共同π₀开展两臂各32,000步的有限PPO筛查，教案臂与PPO＋keep对照的稳定TRAIN均为1／8，完整DEV稳定成功分别为54／64与56／64，相对稳定π₀的净新增分别为6与7；机制门槛未通过。本文据此支持“有限状态上存在可验证恢复指导”及“指导到学生的转化可被分解测量”，尚不支持扩散必要性、可靠无遗忘或最终单策略泛化优势。多种子等成本比较与统一口径迁移评价保留为明确待补实验。</w:t>
       </w:r>
     </w:p>
     <w:p>
@@ -3953,12 +3953,634 @@
         <w:pStyle w:val="Heading3"/>
       </w:pPr>
       <w:r>
-        <w:t>6.4.2 有限PPO试验的工程边界</w:t>
+        <w:t>6.4.2 两臂有限PPO：完整任务改善未转化为教案吸收优势</w:t>
       </w:r>
     </w:p>
     <w:p>
       <w:r>
-        <w:t>T1两臂各32,000步的机制试验已冻结并于2026年10月11日启动，但在四池reset状态合并阶段因随机键数组表示不兼容而停止：新reset采用uint32(2,)键，快照恢复采用标量typed key；该堆叠错误可纯CPU复现，尚未进入PPO更新或终点评价。生产运行T1_paired_ppo_001保守计入200步失败预留，两臂训练均为0／32,000，机制门槛状态为未完成而非不通过。按预声明规则不自动重试、扩大预算或启动正式矩阵；该工程失败不支持关于指导有效性或无效性的结论。[E12]</w:t>
+        <w:t>首次工程运行T1_paired_ppo_001因fresh reset与快照恢复采用不同随机键表示，在四池状态合并时停止，未进入PPO；保守保留200步费用。统一表示后，独立新运行T1_paired_ppo_002通过真实GPU reset与工程检查，两臂均从π₀ Actor／critic、fresh Adam和完整冻结normalizer开始，各执行32,000个学生转移、80次优化更新；所有完整learner检查通过。最终固定32k节点，不根据中间结果选最好。E／G均未更新，TRAIN和完整DEV固定三次复核，solver只做固定首评。[E12][E13]</w:t>
+      </w:r>
+    </w:p>
+    <w:p>
+      <w:pPr>
+        <w:keepNext/>
+        <w:jc w:val="center"/>
+      </w:pPr>
+      <w:r>
+        <w:drawing>
+          <wp:inline xmlns:a="http://schemas.openxmlformats.org/drawingml/2006/main" xmlns:pic="http://schemas.openxmlformats.org/drawingml/2006/picture">
+            <wp:extent cx="6048000" cy="2846118"/>
+            <wp:docPr id="4" name="Picture 4"/>
+            <wp:cNvGraphicFramePr>
+              <a:graphicFrameLocks noChangeAspect="1"/>
+            </wp:cNvGraphicFramePr>
+            <a:graphic>
+              <a:graphicData uri="http://schemas.openxmlformats.org/drawingml/2006/picture">
+                <pic:pic>
+                  <pic:nvPicPr>
+                    <pic:cNvPr id="0" name="t1_train_roots.png"/>
+                    <pic:cNvPicPr/>
+                  </pic:nvPicPr>
+                  <pic:blipFill>
+                    <a:blip r:embed="rId14"/>
+                    <a:stretch>
+                      <a:fillRect/>
+                    </a:stretch>
+                  </pic:blipFill>
+                  <pic:spPr>
+                    <a:xfrm>
+                      <a:off x="0" y="0"/>
+                      <a:ext cx="6048000" cy="2846118"/>
+                    </a:xfrm>
+                    <a:prstGeom prst="rect"/>
+                  </pic:spPr>
+                </pic:pic>
+              </a:graphicData>
+            </a:graphic>
+          </wp:inline>
+        </w:drawing>
+      </w:r>
+    </w:p>
+    <w:p>
+      <w:r>
+        <w:t>图中为原世界XY坐标，三种线型表示三次固定复核；圆点为恢复、叉为失败，轨迹截止于真实终点。本跳跃任务没有预定义几何路径，不人为补造理想参考。完整DEV与solver覆盖图见E13。</w:t>
+      </w:r>
+    </w:p>
+    <w:tbl>
+      <w:tblPr>
+        <w:tblStyle w:val="TableGrid"/>
+        <w:tblW w:type="auto" w:w="0"/>
+        <w:tblLayout w:type="fixed"/>
+        <w:tblLook w:firstColumn="1" w:firstRow="1" w:lastColumn="0" w:lastRow="0" w:noHBand="0" w:noVBand="1" w:val="04A0"/>
+      </w:tblPr>
+      <w:tblGrid>
+        <w:gridCol w:w="2409"/>
+        <w:gridCol w:w="2409"/>
+        <w:gridCol w:w="2409"/>
+        <w:gridCol w:w="2409"/>
+      </w:tblGrid>
+      <w:tr>
+        <w:trPr>
+          <w:cantSplit/>
+          <w:tblHeader/>
+        </w:trPr>
+        <w:tc>
+          <w:tcPr>
+            <w:tcW w:type="dxa" w:w="2409"/>
+            <w:shd w:fill="E6EEF4"/>
+          </w:tcPr>
+          <w:p>
+            <w:pPr>
+              <w:keepNext/>
+              <w:spacing w:after="60" w:before="60" w:line="259" w:lineRule="auto"/>
+            </w:pPr>
+            <w:r>
+              <w:rPr>
+                <w:b/>
+                <w:sz w:val="18"/>
+              </w:rPr>
+              <w:t>指标与分母</w:t>
+            </w:r>
+          </w:p>
+        </w:tc>
+        <w:tc>
+          <w:tcPr>
+            <w:tcW w:type="dxa" w:w="2409"/>
+            <w:shd w:fill="E6EEF4"/>
+          </w:tcPr>
+          <w:p>
+            <w:pPr>
+              <w:keepNext/>
+              <w:spacing w:after="60" w:before="60" w:line="259" w:lineRule="auto"/>
+            </w:pPr>
+            <w:r>
+              <w:rPr>
+                <w:b/>
+                <w:sz w:val="18"/>
+              </w:rPr>
+              <w:t>π₀</w:t>
+            </w:r>
+          </w:p>
+        </w:tc>
+        <w:tc>
+          <w:tcPr>
+            <w:tcW w:type="dxa" w:w="2409"/>
+            <w:shd w:fill="E6EEF4"/>
+          </w:tcPr>
+          <w:p>
+            <w:pPr>
+              <w:keepNext/>
+              <w:spacing w:after="60" w:before="60" w:line="259" w:lineRule="auto"/>
+            </w:pPr>
+            <w:r>
+              <w:rPr>
+                <w:b/>
+                <w:sz w:val="18"/>
+              </w:rPr>
+              <w:t>PPO＋keep</w:t>
+            </w:r>
+          </w:p>
+        </w:tc>
+        <w:tc>
+          <w:tcPr>
+            <w:tcW w:type="dxa" w:w="2409"/>
+            <w:shd w:fill="E6EEF4"/>
+          </w:tcPr>
+          <w:p>
+            <w:pPr>
+              <w:keepNext/>
+              <w:spacing w:after="60" w:before="60" w:line="259" w:lineRule="auto"/>
+            </w:pPr>
+            <w:r>
+              <w:rPr>
+                <w:b/>
+                <w:sz w:val="18"/>
+              </w:rPr>
+              <w:t>PPO＋demo＋keep</w:t>
+            </w:r>
+          </w:p>
+        </w:tc>
+      </w:tr>
+      <w:tr>
+        <w:trPr>
+          <w:cantSplit/>
+        </w:trPr>
+        <w:tc>
+          <w:tcPr>
+            <w:tcW w:type="dxa" w:w="2409"/>
+          </w:tcPr>
+          <w:p>
+            <w:pPr>
+              <w:keepNext/>
+              <w:spacing w:after="60" w:before="60" w:line="259" w:lineRule="auto"/>
+            </w:pPr>
+            <w:r>
+              <w:rPr>
+                <w:sz w:val="18"/>
+              </w:rPr>
+              <w:t>完整DEV三次成功数，每次64</w:t>
+            </w:r>
+          </w:p>
+        </w:tc>
+        <w:tc>
+          <w:tcPr>
+            <w:tcW w:type="dxa" w:w="2409"/>
+          </w:tcPr>
+          <w:p>
+            <w:pPr>
+              <w:keepNext/>
+              <w:spacing w:after="60" w:before="60" w:line="259" w:lineRule="auto"/>
+            </w:pPr>
+            <w:r>
+              <w:rPr>
+                <w:sz w:val="18"/>
+              </w:rPr>
+              <w:t>38／41／47</w:t>
+            </w:r>
+          </w:p>
+        </w:tc>
+        <w:tc>
+          <w:tcPr>
+            <w:tcW w:type="dxa" w:w="2409"/>
+          </w:tcPr>
+          <w:p>
+            <w:pPr>
+              <w:keepNext/>
+              <w:spacing w:after="60" w:before="60" w:line="259" w:lineRule="auto"/>
+            </w:pPr>
+            <w:r>
+              <w:rPr>
+                <w:sz w:val="18"/>
+              </w:rPr>
+              <w:t>56／56／57</w:t>
+            </w:r>
+          </w:p>
+        </w:tc>
+        <w:tc>
+          <w:tcPr>
+            <w:tcW w:type="dxa" w:w="2409"/>
+          </w:tcPr>
+          <w:p>
+            <w:pPr>
+              <w:keepNext/>
+              <w:spacing w:after="60" w:before="60" w:line="259" w:lineRule="auto"/>
+            </w:pPr>
+            <w:r>
+              <w:rPr>
+                <w:sz w:val="18"/>
+              </w:rPr>
+              <w:t>54／55／54</w:t>
+            </w:r>
+          </w:p>
+        </w:tc>
+      </w:tr>
+      <w:tr>
+        <w:trPr>
+          <w:cantSplit/>
+        </w:trPr>
+        <w:tc>
+          <w:tcPr>
+            <w:tcW w:type="dxa" w:w="2409"/>
+          </w:tcPr>
+          <w:p>
+            <w:pPr>
+              <w:keepNext/>
+              <w:spacing w:after="60" w:before="60" w:line="259" w:lineRule="auto"/>
+            </w:pPr>
+            <w:r>
+              <w:rPr>
+                <w:sz w:val="18"/>
+              </w:rPr>
+              <w:t>DEV三次均成功／64</w:t>
+            </w:r>
+          </w:p>
+        </w:tc>
+        <w:tc>
+          <w:tcPr>
+            <w:tcW w:type="dxa" w:w="2409"/>
+          </w:tcPr>
+          <w:p>
+            <w:pPr>
+              <w:keepNext/>
+              <w:spacing w:after="60" w:before="60" w:line="259" w:lineRule="auto"/>
+            </w:pPr>
+            <w:r>
+              <w:rPr>
+                <w:sz w:val="18"/>
+              </w:rPr>
+              <w:t>35</w:t>
+            </w:r>
+          </w:p>
+        </w:tc>
+        <w:tc>
+          <w:tcPr>
+            <w:tcW w:type="dxa" w:w="2409"/>
+          </w:tcPr>
+          <w:p>
+            <w:pPr>
+              <w:keepNext/>
+              <w:spacing w:after="60" w:before="60" w:line="259" w:lineRule="auto"/>
+            </w:pPr>
+            <w:r>
+              <w:rPr>
+                <w:sz w:val="18"/>
+              </w:rPr>
+              <w:t>56</w:t>
+            </w:r>
+          </w:p>
+        </w:tc>
+        <w:tc>
+          <w:tcPr>
+            <w:tcW w:type="dxa" w:w="2409"/>
+          </w:tcPr>
+          <w:p>
+            <w:pPr>
+              <w:keepNext/>
+              <w:spacing w:after="60" w:before="60" w:line="259" w:lineRule="auto"/>
+            </w:pPr>
+            <w:r>
+              <w:rPr>
+                <w:sz w:val="18"/>
+              </w:rPr>
+              <w:t>54</w:t>
+            </w:r>
+          </w:p>
+        </w:tc>
+      </w:tr>
+      <w:tr>
+        <w:trPr>
+          <w:cantSplit/>
+        </w:trPr>
+        <w:tc>
+          <w:tcPr>
+            <w:tcW w:type="dxa" w:w="2409"/>
+          </w:tcPr>
+          <w:p>
+            <w:pPr>
+              <w:keepNext/>
+              <w:spacing w:after="60" w:before="60" w:line="259" w:lineRule="auto"/>
+            </w:pPr>
+            <w:r>
+              <w:rPr>
+                <w:sz w:val="18"/>
+              </w:rPr>
+              <w:t>DEV混合标签／64</w:t>
+            </w:r>
+          </w:p>
+        </w:tc>
+        <w:tc>
+          <w:tcPr>
+            <w:tcW w:type="dxa" w:w="2409"/>
+          </w:tcPr>
+          <w:p>
+            <w:pPr>
+              <w:keepNext/>
+              <w:spacing w:after="60" w:before="60" w:line="259" w:lineRule="auto"/>
+            </w:pPr>
+            <w:r>
+              <w:rPr>
+                <w:sz w:val="18"/>
+              </w:rPr>
+              <w:t>14</w:t>
+            </w:r>
+          </w:p>
+        </w:tc>
+        <w:tc>
+          <w:tcPr>
+            <w:tcW w:type="dxa" w:w="2409"/>
+          </w:tcPr>
+          <w:p>
+            <w:pPr>
+              <w:keepNext/>
+              <w:spacing w:after="60" w:before="60" w:line="259" w:lineRule="auto"/>
+            </w:pPr>
+            <w:r>
+              <w:rPr>
+                <w:sz w:val="18"/>
+              </w:rPr>
+              <w:t>1</w:t>
+            </w:r>
+          </w:p>
+        </w:tc>
+        <w:tc>
+          <w:tcPr>
+            <w:tcW w:type="dxa" w:w="2409"/>
+          </w:tcPr>
+          <w:p>
+            <w:pPr>
+              <w:keepNext/>
+              <w:spacing w:after="60" w:before="60" w:line="259" w:lineRule="auto"/>
+            </w:pPr>
+            <w:r>
+              <w:rPr>
+                <w:sz w:val="18"/>
+              </w:rPr>
+              <w:t>1</w:t>
+            </w:r>
+          </w:p>
+        </w:tc>
+      </w:tr>
+      <w:tr>
+        <w:trPr>
+          <w:cantSplit/>
+        </w:trPr>
+        <w:tc>
+          <w:tcPr>
+            <w:tcW w:type="dxa" w:w="2409"/>
+          </w:tcPr>
+          <w:p>
+            <w:pPr>
+              <w:keepNext/>
+              <w:spacing w:after="60" w:before="60" w:line="259" w:lineRule="auto"/>
+            </w:pPr>
+            <w:r>
+              <w:rPr>
+                <w:sz w:val="18"/>
+              </w:rPr>
+              <w:t>相对稳定π₀的新增／旧损失／净增</w:t>
+            </w:r>
+          </w:p>
+        </w:tc>
+        <w:tc>
+          <w:tcPr>
+            <w:tcW w:type="dxa" w:w="2409"/>
+          </w:tcPr>
+          <w:p>
+            <w:pPr>
+              <w:keepNext/>
+              <w:spacing w:after="60" w:before="60" w:line="259" w:lineRule="auto"/>
+            </w:pPr>
+            <w:r>
+              <w:rPr>
+                <w:sz w:val="18"/>
+              </w:rPr>
+              <w:t>—</w:t>
+            </w:r>
+          </w:p>
+        </w:tc>
+        <w:tc>
+          <w:tcPr>
+            <w:tcW w:type="dxa" w:w="2409"/>
+          </w:tcPr>
+          <w:p>
+            <w:pPr>
+              <w:keepNext/>
+              <w:spacing w:after="60" w:before="60" w:line="259" w:lineRule="auto"/>
+            </w:pPr>
+            <w:r>
+              <w:rPr>
+                <w:sz w:val="18"/>
+              </w:rPr>
+              <w:t>10／3／＋7</w:t>
+            </w:r>
+          </w:p>
+        </w:tc>
+        <w:tc>
+          <w:tcPr>
+            <w:tcW w:type="dxa" w:w="2409"/>
+          </w:tcPr>
+          <w:p>
+            <w:pPr>
+              <w:keepNext/>
+              <w:spacing w:after="60" w:before="60" w:line="259" w:lineRule="auto"/>
+            </w:pPr>
+            <w:r>
+              <w:rPr>
+                <w:sz w:val="18"/>
+              </w:rPr>
+              <w:t>6／0／＋6</w:t>
+            </w:r>
+          </w:p>
+        </w:tc>
+      </w:tr>
+      <w:tr>
+        <w:trPr>
+          <w:cantSplit/>
+        </w:trPr>
+        <w:tc>
+          <w:tcPr>
+            <w:tcW w:type="dxa" w:w="2409"/>
+          </w:tcPr>
+          <w:p>
+            <w:pPr>
+              <w:keepNext/>
+              <w:spacing w:after="60" w:before="60" w:line="259" w:lineRule="auto"/>
+            </w:pPr>
+            <w:r>
+              <w:rPr>
+                <w:sz w:val="18"/>
+              </w:rPr>
+              <w:t>稳定TRAIN根／8</w:t>
+            </w:r>
+          </w:p>
+        </w:tc>
+        <w:tc>
+          <w:tcPr>
+            <w:tcW w:type="dxa" w:w="2409"/>
+          </w:tcPr>
+          <w:p>
+            <w:pPr>
+              <w:keepNext/>
+              <w:spacing w:after="60" w:before="60" w:line="259" w:lineRule="auto"/>
+            </w:pPr>
+            <w:r>
+              <w:rPr>
+                <w:sz w:val="18"/>
+              </w:rPr>
+              <w:t>未重测</w:t>
+            </w:r>
+          </w:p>
+        </w:tc>
+        <w:tc>
+          <w:tcPr>
+            <w:tcW w:type="dxa" w:w="2409"/>
+          </w:tcPr>
+          <w:p>
+            <w:pPr>
+              <w:keepNext/>
+              <w:spacing w:after="60" w:before="60" w:line="259" w:lineRule="auto"/>
+            </w:pPr>
+            <w:r>
+              <w:rPr>
+                <w:sz w:val="18"/>
+              </w:rPr>
+              <w:t>1</w:t>
+            </w:r>
+          </w:p>
+        </w:tc>
+        <w:tc>
+          <w:tcPr>
+            <w:tcW w:type="dxa" w:w="2409"/>
+          </w:tcPr>
+          <w:p>
+            <w:pPr>
+              <w:keepNext/>
+              <w:spacing w:after="60" w:before="60" w:line="259" w:lineRule="auto"/>
+            </w:pPr>
+            <w:r>
+              <w:rPr>
+                <w:sz w:val="18"/>
+              </w:rPr>
+              <w:t>1</w:t>
+            </w:r>
+          </w:p>
+        </w:tc>
+      </w:tr>
+      <w:tr>
+        <w:trPr>
+          <w:cantSplit/>
+        </w:trPr>
+        <w:tc>
+          <w:tcPr>
+            <w:tcW w:type="dxa" w:w="2409"/>
+          </w:tcPr>
+          <w:p>
+            <w:pPr>
+              <w:keepNext w:val="0"/>
+              <w:spacing w:after="60" w:before="60" w:line="259" w:lineRule="auto"/>
+            </w:pPr>
+            <w:r>
+              <w:rPr>
+                <w:sz w:val="18"/>
+              </w:rPr>
+              <w:t>solver固定首评／7</w:t>
+            </w:r>
+          </w:p>
+        </w:tc>
+        <w:tc>
+          <w:tcPr>
+            <w:tcW w:type="dxa" w:w="2409"/>
+          </w:tcPr>
+          <w:p>
+            <w:pPr>
+              <w:keepNext w:val="0"/>
+              <w:spacing w:after="60" w:before="60" w:line="259" w:lineRule="auto"/>
+            </w:pPr>
+            <w:r>
+              <w:rPr>
+                <w:sz w:val="18"/>
+              </w:rPr>
+              <w:t>未重测</w:t>
+            </w:r>
+          </w:p>
+        </w:tc>
+        <w:tc>
+          <w:tcPr>
+            <w:tcW w:type="dxa" w:w="2409"/>
+          </w:tcPr>
+          <w:p>
+            <w:pPr>
+              <w:keepNext w:val="0"/>
+              <w:spacing w:after="60" w:before="60" w:line="259" w:lineRule="auto"/>
+            </w:pPr>
+            <w:r>
+              <w:rPr>
+                <w:sz w:val="18"/>
+              </w:rPr>
+              <w:t>1</w:t>
+            </w:r>
+          </w:p>
+        </w:tc>
+        <w:tc>
+          <w:tcPr>
+            <w:tcW w:type="dxa" w:w="2409"/>
+          </w:tcPr>
+          <w:p>
+            <w:pPr>
+              <w:keepNext w:val="0"/>
+              <w:spacing w:after="60" w:before="60" w:line="259" w:lineRule="auto"/>
+            </w:pPr>
+            <w:r>
+              <w:rPr>
+                <w:sz w:val="18"/>
+              </w:rPr>
+              <w:t>1</w:t>
+            </w:r>
+          </w:p>
+        </w:tc>
+      </w:tr>
+    </w:tbl>
+    <w:p>
+      <w:pPr>
+        <w:spacing w:after="0"/>
+      </w:pPr>
+    </w:p>
+    <w:p>
+      <w:r>
+        <w:t>教案臂在root10三次成功，对照三次失败；但root68为1／0／1，不能写为稳定成功。root30、37、26两臂均三次失败，required-root保持与TRAIN至少5／8门槛未满足。教案臂的DEV稳定旧损失为0，且B／D没有出现两次确认的超过5个百分点退化；第三次B单次警告仍保留。该小开发集保持guard不是正式非劣统计或零遗忘。相对于稳定π₀的净新增＋6低于对照＋7，solver1／7也未达到至少3／7。因此机制筛查未通过，正式十五运行与TEST暂停；本结果不支持指导带来了独立学生净优势，但不能据此断言完整JIT在所有配置下无效。</w:t>
+      </w:r>
+    </w:p>
+    <w:p>
+      <w:r>
+        <w:t>π₀有14个混合标签，故学生稳定成功减去π₀稳定成功并不等于严格相对净新增；原成功、原失败与原歧义分别列账。三次固定评价不是三个训练种子，两个方法也仅有一个配对pilot种子1010257101。[E13]</w:t>
+      </w:r>
+    </w:p>
+    <w:p>
+      <w:pPr>
+        <w:pStyle w:val="Heading3"/>
+      </w:pPr>
+      <w:r>
+        <w:t>6.4.3 已执行的零交互优化诊断与下一步边界</w:t>
+      </w:r>
+    </w:p>
+    <w:p>
+      <w:r>
+        <w:t>在同一7291条TRAIN观测上，教案臂原教案525帧MSE由0.0093994降至0.0085829，新教案228帧由0.0065063降至0.0058077，分别约改善8.7％和10.7％。保持6289帧以独立重建π₀确定性动作为目标，终点MSE为0.00007364，对照为0.00004638；这些拟合误差不替代闭环成功。真实80次更新的加权demo／PPO Actor梯度范数比中位为1.88％，范围0.82％至2.92％，37次方向夹角为负。该观察提供目标相对强度与方向冲突线索，未构成失败因果证明。[E13]</w:t>
+      </w:r>
+    </w:p>
+    <w:p>
+      <w:r>
+        <w:t>进一步对保存的0／16k／32k节点进行固定TRAIN求导，未更新参数。教案臂32k原／新指导梯度余弦为0.973，新增指导／历史BC稳定轨迹为0.972；新增指导／keep为−0.611。不同初始化附近的梯度关系不同，不能据历史BC冲突认定容量不足。critic范数较大与全局clip较小也不能绕过Adam而直接解释为Actor更新被压制。</w:t>
+      </w:r>
+    </w:p>
+    <w:p>
+      <w:r>
+        <w:t>下一步应先捕获同一真实minibatch的目标梯度与Adam前后状态，离线分离PPO、demo、keep及critic对参数增量的作用，再决定是否需要改变优化合同。现有日志未保存完整梯度向量和每个minibatch的Adam前状态，这个反事实实验尚未执行。不得据现有范数直接扩训、换种子或进行无预声明权重搜索。[E13]</w:t>
+      </w:r>
+    </w:p>
+    <w:p>
+      <w:r>
+        <w:t>T1_002实际charged为328,308，含评价padding；prior1,123,052已包括首次工程失败200，D2累计1,451,360／2,000,000。墙钟1,591.64秒。E／G优化次数为0，既有G预训练成本另列；本次保存数据分析新增物理和学习更新均为0。[E13]</w:t>
       </w:r>
     </w:p>
     <w:p>
@@ -4360,7 +4982,7 @@
         <w:drawing>
           <wp:inline xmlns:a="http://schemas.openxmlformats.org/drawingml/2006/main" xmlns:pic="http://schemas.openxmlformats.org/drawingml/2006/picture">
             <wp:extent cx="6048000" cy="5117538"/>
-            <wp:docPr id="4" name="Picture 4"/>
+            <wp:docPr id="5" name="Picture 5"/>
             <wp:cNvGraphicFramePr>
               <a:graphicFrameLocks noChangeAspect="1"/>
             </wp:cNvGraphicFramePr>
@@ -4372,7 +4994,7 @@
                     <pic:cNvPicPr/>
                   </pic:nvPicPr>
                   <pic:blipFill>
-                    <a:blip r:embed="rId14"/>
+                    <a:blip r:embed="rId15"/>
                     <a:stretch>
                       <a:fillRect/>
                     </a:stretch>
@@ -5214,7 +5836,7 @@
         <w:shd w:fill="FFF2CC"/>
       </w:pPr>
       <w:r>
-        <w:t>【待补P1：最终学生净收益】这里放同一源策略、统一成功标准和完整自然起点下的独立训练种子结果。2026年10月11日已声明三个配对外循环训练种子1011501、1011502、1011503，各臂共同π₀，适用臂共同预训练G73，后续模型、数据及随机流独立；应准确称为共同π₀及预训练G条件下的独立外循环训练。三次固定复核不能替代训练种子。用户已授权条件性实施：T0运行链与T1两臂32k机制筛查通过后先执行M1／M0；整体收益及保持性通过才进入其余消融。正式矩阵尚未执行，应给出逐种子成功率、新增、旧损失及区间；M0明确包含keep，仅匹配M1实际新增物理预算，E／G优化与GPU时间另列。</w:t>
+        <w:t>【待补P1：最终学生净收益】这里放同一源策略、统一成功标准和完整自然起点下的独立训练种子结果。2026年10月11日已声明三个配对外循环训练种子1011501、1011502、1011503，各臂共同π₀，适用臂共同预训练G73，后续模型、数据及随机流独立；应准确称为共同π₀及预训练G条件下的独立外循环训练。三次固定复核不能替代训练种子。用户已授权条件性实施：T0运行链与T1两臂32k机制筛查通过后先执行M1／M0；整体收益及保持性通过才进入其余消融。T1完整机制筛查未通过，正式矩阵暂停且尚未执行，应给出逐种子成功率、新增、旧损失及区间；M0明确包含keep，仅匹配M1实际新增物理预算，E／G优化与GPU时间另列。</w:t>
       </w:r>
     </w:p>
     <w:p>
@@ -5334,7 +5956,7 @@
       <w:r>
         <w:t xml:space="preserve">[1] Fahmi S, Ilvonen A, Zapolsky S, et al. Bicycle Acrobatics with Reinforcement Learning. arXiv:2608.00880, 2026. </w:t>
       </w:r>
-      <w:hyperlink r:id="rId15">
+      <w:hyperlink r:id="rId16">
         <w:r>
           <w:rPr>
             <w:color w:val="195C80"/>
@@ -5350,7 +5972,7 @@
       <w:r>
         <w:t xml:space="preserve">[2] Rho S, Fahmi S, Kim J, Ilvonen A, Ha S, Nelson G. LineRides: Line-Guided Reinforcement Learning for Bicycle Robot Stunts. arXiv:2605.05110, 2026. </w:t>
       </w:r>
-      <w:hyperlink r:id="rId16">
+      <w:hyperlink r:id="rId17">
         <w:r>
           <w:rPr>
             <w:color w:val="195C80"/>
@@ -5366,7 +5988,7 @@
       <w:r>
         <w:t xml:space="preserve">[3] Johannink T, Bahl S, Nair A, et al. Residual Reinforcement Learning for Robot Control. arXiv:1812.03201, 2018. </w:t>
       </w:r>
-      <w:hyperlink r:id="rId17">
+      <w:hyperlink r:id="rId18">
         <w:r>
           <w:rPr>
             <w:color w:val="195C80"/>
@@ -5382,7 +6004,7 @@
       <w:r>
         <w:t xml:space="preserve">[4] Schulman J, Wolski F, Dhariwal P, Radford A, Klimov O. Proximal Policy Optimization Algorithms. arXiv:1707.06347, 2017. </w:t>
       </w:r>
-      <w:hyperlink r:id="rId18">
+      <w:hyperlink r:id="rId19">
         <w:r>
           <w:rPr>
             <w:color w:val="195C80"/>
@@ -5398,7 +6020,7 @@
       <w:r>
         <w:t xml:space="preserve">[5] Burda Y, Edwards H, Storkey A, Klimov O. Exploration by Random Network Distillation. arXiv:1810.12894, 2018. </w:t>
       </w:r>
-      <w:hyperlink r:id="rId19">
+      <w:hyperlink r:id="rId20">
         <w:r>
           <w:rPr>
             <w:color w:val="195C80"/>
@@ -5414,7 +6036,7 @@
       <w:r>
         <w:t xml:space="preserve">[6] Florensa C, Held D, Wulfmeier M, Zhang M, Abbeel P. Reverse Curriculum Generation for Reinforcement Learning. CoRL, 2017. </w:t>
       </w:r>
-      <w:hyperlink r:id="rId20">
+      <w:hyperlink r:id="rId21">
         <w:r>
           <w:rPr>
             <w:color w:val="195C80"/>
@@ -5430,7 +6052,7 @@
       <w:r>
         <w:t xml:space="preserve">[7] Ho J, Jain A, Abbeel P. Denoising Diffusion Probabilistic Models. arXiv:2006.11239, 2020. </w:t>
       </w:r>
-      <w:hyperlink r:id="rId21">
+      <w:hyperlink r:id="rId22">
         <w:r>
           <w:rPr>
             <w:color w:val="195C80"/>
@@ -5446,7 +6068,7 @@
       <w:r>
         <w:t xml:space="preserve">[8] Chi C, Feng S, Du Y, et al. Diffusion Policy: Visuomotor Policy Learning via Action Diffusion. Robotics: Science and Systems, 2023. </w:t>
       </w:r>
-      <w:hyperlink r:id="rId22">
+      <w:hyperlink r:id="rId23">
         <w:r>
           <w:rPr>
             <w:color w:val="195C80"/>
@@ -5462,7 +6084,7 @@
       <w:r>
         <w:t xml:space="preserve">[9] Ross S, Gordon G, Bagnell D. A Reduction of Imitation Learning and Structured Prediction to No-Regret Online Learning. AISTATS, PMLR 15:627–635, 2011. </w:t>
       </w:r>
-      <w:hyperlink r:id="rId23">
+      <w:hyperlink r:id="rId24">
         <w:r>
           <w:rPr>
             <w:color w:val="195C80"/>
@@ -5592,7 +6214,7 @@
               <w:keepNext/>
               <w:spacing w:after="60" w:before="60" w:line="259" w:lineRule="auto"/>
             </w:pPr>
-            <w:hyperlink r:id="rId24">
+            <w:hyperlink r:id="rId25">
               <w:r>
                 <w:rPr>
                   <w:color w:val="195C80"/>
@@ -5650,7 +6272,7 @@
               <w:keepNext/>
               <w:spacing w:after="60" w:before="60" w:line="259" w:lineRule="auto"/>
             </w:pPr>
-            <w:hyperlink r:id="rId25">
+            <w:hyperlink r:id="rId26">
               <w:r>
                 <w:rPr>
                   <w:color w:val="195C80"/>
@@ -5664,7 +6286,7 @@
               </w:rPr>
               <w:t>；</w:t>
             </w:r>
-            <w:hyperlink r:id="rId26">
+            <w:hyperlink r:id="rId27">
               <w:r>
                 <w:rPr>
                   <w:color w:val="195C80"/>
@@ -5722,7 +6344,7 @@
               <w:keepNext/>
               <w:spacing w:after="60" w:before="60" w:line="259" w:lineRule="auto"/>
             </w:pPr>
-            <w:hyperlink r:id="rId27">
+            <w:hyperlink r:id="rId28">
               <w:r>
                 <w:rPr>
                   <w:color w:val="195C80"/>
@@ -5780,7 +6402,7 @@
               <w:keepNext/>
               <w:spacing w:after="60" w:before="60" w:line="259" w:lineRule="auto"/>
             </w:pPr>
-            <w:hyperlink r:id="rId28">
+            <w:hyperlink r:id="rId29">
               <w:r>
                 <w:rPr>
                   <w:color w:val="195C80"/>
@@ -5838,7 +6460,7 @@
               <w:keepNext/>
               <w:spacing w:after="60" w:before="60" w:line="259" w:lineRule="auto"/>
             </w:pPr>
-            <w:hyperlink r:id="rId29">
+            <w:hyperlink r:id="rId30">
               <w:r>
                 <w:rPr>
                   <w:color w:val="195C80"/>
@@ -5896,7 +6518,7 @@
               <w:keepNext/>
               <w:spacing w:after="60" w:before="60" w:line="259" w:lineRule="auto"/>
             </w:pPr>
-            <w:hyperlink r:id="rId30">
+            <w:hyperlink r:id="rId31">
               <w:r>
                 <w:rPr>
                   <w:color w:val="195C80"/>
@@ -5954,7 +6576,7 @@
               <w:keepNext/>
               <w:spacing w:after="60" w:before="60" w:line="259" w:lineRule="auto"/>
             </w:pPr>
-            <w:hyperlink r:id="rId31">
+            <w:hyperlink r:id="rId32">
               <w:r>
                 <w:rPr>
                   <w:color w:val="195C80"/>
@@ -6012,7 +6634,7 @@
               <w:keepNext/>
               <w:spacing w:after="60" w:before="60" w:line="259" w:lineRule="auto"/>
             </w:pPr>
-            <w:hyperlink r:id="rId32">
+            <w:hyperlink r:id="rId33">
               <w:r>
                 <w:rPr>
                   <w:color w:val="195C80"/>
@@ -6070,7 +6692,7 @@
               <w:keepNext/>
               <w:spacing w:after="60" w:before="60" w:line="259" w:lineRule="auto"/>
             </w:pPr>
-            <w:hyperlink r:id="rId33">
+            <w:hyperlink r:id="rId34">
               <w:r>
                 <w:rPr>
                   <w:color w:val="195C80"/>
@@ -6128,7 +6750,7 @@
               <w:keepNext/>
               <w:spacing w:after="60" w:before="60" w:line="259" w:lineRule="auto"/>
             </w:pPr>
-            <w:hyperlink r:id="rId34">
+            <w:hyperlink r:id="rId35">
               <w:r>
                 <w:rPr>
                   <w:color w:val="195C80"/>
@@ -6186,7 +6808,7 @@
               <w:keepNext/>
               <w:spacing w:after="60" w:before="60" w:line="259" w:lineRule="auto"/>
             </w:pPr>
-            <w:hyperlink r:id="rId35">
+            <w:hyperlink r:id="rId36">
               <w:r>
                 <w:rPr>
                   <w:color w:val="195C80"/>
@@ -6224,7 +6846,7 @@
           </w:tcPr>
           <w:p>
             <w:pPr>
-              <w:keepNext w:val="0"/>
+              <w:keepNext/>
               <w:spacing w:after="60" w:before="60" w:line="259" w:lineRule="auto"/>
             </w:pPr>
             <w:r>
@@ -6241,15 +6863,15 @@
           </w:tcPr>
           <w:p>
             <w:pPr>
-              <w:keepNext w:val="0"/>
-              <w:spacing w:after="60" w:before="60" w:line="259" w:lineRule="auto"/>
-            </w:pPr>
-            <w:hyperlink r:id="rId36">
+              <w:keepNext/>
+              <w:spacing w:after="60" w:before="60" w:line="259" w:lineRule="auto"/>
+            </w:pPr>
+            <w:hyperlink r:id="rId37">
               <w:r>
                 <w:rPr>
                   <w:color w:val="195C80"/>
                 </w:rPr>
-                <w:t>T1工程停止收据</w:t>
+                <w:t>T1首次工程停止收据</w:t>
               </w:r>
             </w:hyperlink>
           </w:p>
@@ -6260,14 +6882,72 @@
           </w:tcPr>
           <w:p>
             <w:pPr>
-              <w:keepNext w:val="0"/>
+              <w:keepNext/>
               <w:spacing w:after="60" w:before="60" w:line="259" w:lineRule="auto"/>
             </w:pPr>
             <w:r>
               <w:rPr>
                 <w:sz w:val="18"/>
               </w:rPr>
-              <w:t>两臂训练0，机制评价尚未完成</w:t>
+              <w:t>历史失败与修复，不替代后续002结果</w:t>
+            </w:r>
+          </w:p>
+        </w:tc>
+      </w:tr>
+      <w:tr>
+        <w:trPr>
+          <w:cantSplit/>
+        </w:trPr>
+        <w:tc>
+          <w:tcPr>
+            <w:tcW w:type="dxa" w:w="3213"/>
+          </w:tcPr>
+          <w:p>
+            <w:pPr>
+              <w:keepNext w:val="0"/>
+              <w:spacing w:after="60" w:before="60" w:line="259" w:lineRule="auto"/>
+            </w:pPr>
+            <w:r>
+              <w:rPr>
+                <w:sz w:val="18"/>
+              </w:rPr>
+              <w:t>E13</w:t>
+            </w:r>
+          </w:p>
+        </w:tc>
+        <w:tc>
+          <w:tcPr>
+            <w:tcW w:type="dxa" w:w="3213"/>
+          </w:tcPr>
+          <w:p>
+            <w:pPr>
+              <w:keepNext w:val="0"/>
+              <w:spacing w:after="60" w:before="60" w:line="259" w:lineRule="auto"/>
+            </w:pPr>
+            <w:hyperlink r:id="rId38">
+              <w:r>
+                <w:rPr>
+                  <w:color w:val="195C80"/>
+                </w:rPr>
+                <w:t>T1两臂完整评价与零物理机制诊断</w:t>
+              </w:r>
+            </w:hyperlink>
+          </w:p>
+        </w:tc>
+        <w:tc>
+          <w:tcPr>
+            <w:tcW w:type="dxa" w:w="3213"/>
+          </w:tcPr>
+          <w:p>
+            <w:pPr>
+              <w:keepNext w:val="0"/>
+              <w:spacing w:after="60" w:before="60" w:line="259" w:lineRule="auto"/>
+            </w:pPr>
+            <w:r>
+              <w:rPr>
+                <w:sz w:val="18"/>
+              </w:rPr>
+              <w:t>第6.4.2—6.4.3节；逐根三次、完整DEV、成本和负结果</w:t>
             </w:r>
           </w:p>
         </w:tc>

</xml_diff>